<commit_message>
Staff feedback Pt 2: add Darlene + GAPFILL direction, invoice statuses (Oct 9)
Co-Authored-By: Claude Opus 4.8 <noreply@anthropic.com>
Claude-Session: https://claude.ai/code/session_01UvstzJAZPbp2Wf3zcn662S
</commit_message>
<xml_diff>
--- a/HDDR-documents/HDDR-Staff-Feedback-Reply-Oct-9-2026.docx
+++ b/HDDR-documents/HDDR-Staff-Feedback-Reply-Oct-9-2026.docx
@@ -32,23 +32,41 @@
         <w:spacing w:before="240"/>
       </w:pPr>
       <w:r>
-        <w:t xml:space="preserve">Darlene only shows Full Grooms and De-Shed + Full Groom</w:t>
-      </w:r>
-    </w:p>
-    <w:p>
-      <w:pPr>
-        <w:spacing w:after="120"/>
-      </w:pPr>
-      <w:r>
-        <w:t xml:space="preserve">That's not a fluke and it's not something I set on purpose. It's just how Darlene's services came over from EasyBusy. If she also does Luxury Spa, De-Shed, Sanitary Trim or Bath Only, go to her page, open the Services tab, tick those, and save. Then she'll show up for them. This is the same reason she didn't come up for Leroy's Lux Spa on the 17th — the system only offers a groomer for the services she's checked for.</w:t>
-      </w:r>
-    </w:p>
-    <w:p>
-      <w:pPr>
-        <w:spacing w:after="120"/>
-      </w:pPr>
-      <w:r>
-        <w:t xml:space="preserve">So go ahead and check every groomer's Services and fix any that are short. That one thing will clear up a lot.</w:t>
+        <w:t xml:space="preserve">Darlene</w:t>
+      </w:r>
+    </w:p>
+    <w:p>
+      <w:pPr>
+        <w:spacing w:after="120"/>
+      </w:pPr>
+      <w:r>
+        <w:t xml:space="preserve">Darlene is set up on purpose for only the Full-Groom items, which includes Full Grooms and De-Shed + Full Groom. I'd rather she not do Lux Spas, De-Sheds, Sanitary Trims and so on. That's why she didn't come up for Leroy's Lux Spa on the 17th, and it's working the way I want it.</w:t>
+      </w:r>
+    </w:p>
+    <w:p>
+      <w:pPr>
+        <w:spacing w:after="120"/>
+      </w:pPr>
+      <w:r>
+        <w:t xml:space="preserve">Here's the part that matters for you: the front desk can override that. If you need to put Darlene on a Lux Spa, use </w:t>
+      </w:r>
+      <w:r>
+        <w:rPr>
+          <w:b/>
+          <w:bCs/>
+        </w:rPr>
+        <w:t xml:space="preserve">Any groomer or bather</w:t>
+      </w:r>
+      <w:r>
+        <w:t xml:space="preserve"> on the booking screen and she'll show. What I don't want is online clients being able to put her on those — and they can't. Online only offers the groomers who are set up for that service. So you've got the flexibility and the clients don't.</w:t>
+      </w:r>
+    </w:p>
+    <w:p>
+      <w:pPr>
+        <w:spacing w:after="120"/>
+      </w:pPr>
+      <w:r>
+        <w:t xml:space="preserve">While you're in there, go ahead and check every groomer's Services tab and make sure each one is set for what they actually do. That'll clear up a few of these.</w:t>
       </w:r>
     </w:p>
     <w:p>
@@ -75,7 +93,7 @@
         <w:t xml:space="preserve">Gaps to fill</w:t>
       </w:r>
       <w:r>
-        <w:t xml:space="preserve"> banner. It shows any open time that sits before a later groom, so you can try to fill it. I just made it bright lime green so it really jumps out. Green means fill it.</w:t>
+        <w:t xml:space="preserve"> banner. It shows any open time that sits before a later groom, so you can try to fill it. I made it bright lime green so it jumps right out. Green means fill it.</w:t>
       </w:r>
     </w:p>
     <w:p>
@@ -92,15 +110,53 @@
         <w:spacing w:after="120"/>
       </w:pPr>
       <w:r>
-        <w:t xml:space="preserve">Good questions. Here's how it works. Only clients booking themselves online get that 10% automatically. When you book someone over the phone or in person, it does not come off by itself — you'd put a code on it by hand if we wanted to give it. And it's not just today. It's any day: whenever the time the client picks happens to fill a gap in that day's schedule, it shows up with the discount.</w:t>
-      </w:r>
-    </w:p>
-    <w:p>
-      <w:pPr>
-        <w:spacing w:after="120"/>
-      </w:pPr>
-      <w:r>
-        <w:t xml:space="preserve">[David: do you want the day-of phone bookings to get that 10% too, or keep it online-only? Your call and I'll set it either way.]</w:t>
+        <w:t xml:space="preserve">Here's how I want this to work, and it's set up this way now. It's a real promo code: </w:t>
+      </w:r>
+      <w:r>
+        <w:rPr>
+          <w:b/>
+          <w:bCs/>
+        </w:rPr>
+        <w:t xml:space="preserve">GAPFILL</w:t>
+      </w:r>
+      <w:r>
+        <w:t xml:space="preserve">, 10% off a groom.</w:t>
+      </w:r>
+    </w:p>
+    <w:p>
+      <w:pPr>
+        <w:spacing w:after="120"/>
+      </w:pPr>
+      <w:r>
+        <w:t xml:space="preserve">Online, the 10% comes off by itself only for </w:t>
+      </w:r>
+      <w:r>
+        <w:rPr>
+          <w:b/>
+          <w:bCs/>
+        </w:rPr>
+        <w:t xml:space="preserve">today and tomorrow</w:t>
+      </w:r>
+      <w:r>
+        <w:t xml:space="preserve">, when the client picks a time that fills a gap. Not for days further out.</w:t>
+      </w:r>
+    </w:p>
+    <w:p>
+      <w:pPr>
+        <w:spacing w:after="120"/>
+      </w:pPr>
+      <w:r>
+        <w:t xml:space="preserve">But I want every day to have no gaps. So when you see a hole in the schedule, call a client and offer them the 10% to come fill it — on any day — and you apply </w:t>
+      </w:r>
+      <w:r>
+        <w:rPr>
+          <w:b/>
+          <w:bCs/>
+        </w:rPr>
+        <w:t xml:space="preserve">GAPFILL</w:t>
+      </w:r>
+      <w:r>
+        <w:t xml:space="preserve"> to the booking. Because it's a real code, every use is tracked on the Promo codes page, so we can see how well filling gaps is working for us. That's the whole point: get the gaps filled and know what it's doing for us.</w:t>
       </w:r>
     </w:p>
     <w:p>
@@ -109,25 +165,35 @@
         <w:spacing w:before="240"/>
       </w:pPr>
       <w:r>
-        <w:t xml:space="preserve">Searching for unpaid invoices</w:t>
-      </w:r>
-    </w:p>
-    <w:p>
-      <w:pPr>
-        <w:spacing w:after="120"/>
-      </w:pPr>
-      <w:r>
-        <w:t xml:space="preserve">Done. On the Invoices page there's now an </w:t>
+        <w:t xml:space="preserve">Searching invoices</w:t>
+      </w:r>
+    </w:p>
+    <w:p>
+      <w:pPr>
+        <w:spacing w:after="120"/>
+      </w:pPr>
+      <w:r>
+        <w:t xml:space="preserve">Done. The Invoices page now has a </w:t>
       </w:r>
       <w:r>
         <w:rPr>
           <w:b/>
           <w:bCs/>
         </w:rPr>
-        <w:t xml:space="preserve">Only unpaid</w:t>
-      </w:r>
-      <w:r>
-        <w:t xml:space="preserve"> box. Tick it and press Search and you get just the ones with money still owed, newest first. No more digging through each client.</w:t>
+        <w:t xml:space="preserve">Show</w:t>
+      </w:r>
+      <w:r>
+        <w:t xml:space="preserve"> box where you can pick </w:t>
+      </w:r>
+      <w:r>
+        <w:rPr>
+          <w:b/>
+          <w:bCs/>
+        </w:rPr>
+        <w:t xml:space="preserve">All, Draft, Unpaid, or Paid</w:t>
+      </w:r>
+      <w:r>
+        <w:t xml:space="preserve">. So you can pull up just the unpaid ones, or see everything, however you need it.</w:t>
       </w:r>
     </w:p>
     <w:p>
@@ -136,23 +202,15 @@
         <w:spacing w:before="240"/>
       </w:pPr>
       <w:r>
-        <w:t xml:space="preserve">Leroy's Lux Spa on the 17th — Darlene not showing, and only one time per groomer</w:t>
-      </w:r>
-    </w:p>
-    <w:p>
-      <w:pPr>
-        <w:spacing w:after="120"/>
-      </w:pPr>
-      <w:r>
-        <w:t xml:space="preserve">The Darlene part is the Services thing above — she's not checked for Lux Spa yet.</w:t>
-      </w:r>
-    </w:p>
-    <w:p>
-      <w:pPr>
-        <w:spacing w:after="120"/>
-      </w:pPr>
-      <w:r>
-        <w:t xml:space="preserve">On the times: that list shows the first open back-to-back time for each groomer, to keep their days packed. When you want a different time, use </w:t>
+        <w:t xml:space="preserve">"Only one time per groomer" when booking</w:t>
+      </w:r>
+    </w:p>
+    <w:p>
+      <w:pPr>
+        <w:spacing w:after="120"/>
+      </w:pPr>
+      <w:r>
+        <w:t xml:space="preserve">That list shows the first open back-to-back time for each groomer, to keep their days packed. When you want a different time, use </w:t>
       </w:r>
       <w:r>
         <w:rPr>
@@ -162,7 +220,7 @@
         <w:t xml:space="preserve">Or book a specific groomer and time</w:t>
       </w:r>
       <w:r>
-        <w:t xml:space="preserve"> right below it — pick the groomer and type any time you want. And if you need a groomer who isn't set up for that service, tick </w:t>
+        <w:t xml:space="preserve"> right below it — pick the groomer and type any time. And for a groomer who isn't set up for that service, tick </w:t>
       </w:r>
       <w:r>
         <w:rPr>
@@ -172,7 +230,7 @@
         <w:t xml:space="preserve">Any groomer or bather</w:t>
       </w:r>
       <w:r>
-        <w:t xml:space="preserve"> and they'll show too.</w:t>
+        <w:t xml:space="preserve">.</w:t>
       </w:r>
     </w:p>
     <w:p>
@@ -189,7 +247,7 @@
         <w:spacing w:after="120"/>
       </w:pPr>
       <w:r>
-        <w:t xml:space="preserve">You caught a real one. A future booking that doesn't have a price on it yet was showing "$0.00 — Paid," which looks like it was paid when really there was just nothing on it. I changed it so a visit with no charge shows a dash instead of "Paid." The ones with a real price, like Briggs on the 31st for $226, still show what's due. That's why Barbara and Leroy's all read as paid — they're zero.</w:t>
+        <w:t xml:space="preserve">You caught a real one. A future booking with no price on it yet was showing "$0.00 — Paid," which looked like it was paid when there was really just nothing on it. Now a visit with no charge shows a dash instead of "Paid." The ones with a real price, like Briggs on the 31st for $226, still show what's due. That's why Barbara and Leroy's all read paid — they're zero.</w:t>
       </w:r>
     </w:p>
     <w:p>
@@ -198,7 +256,7 @@
         <w:spacing w:before="240"/>
       </w:pPr>
       <w:r>
-        <w:t xml:space="preserve">Why is bathing marked in our Weekly Hours, and why is it blocked</w:t>
+        <w:t xml:space="preserve">Why is bathing marked in our Weekly Hours, and why was it blocked</w:t>
       </w:r>
     </w:p>
     <w:p>
@@ -243,7 +301,7 @@
         <w:spacing w:after="120"/>
       </w:pPr>
       <w:r>
-        <w:t xml:space="preserve">Same answer — that was the Extra days box, which is just for a one-off day now. For bathing every single week, use the new Bathes from/to columns. Those run every week until we change them.</w:t>
+        <w:t xml:space="preserve">Same answer — that was the Extra days box, which is just for a one-off day. For bathing every single week, use the new Bathes from/to columns. Those run every week until we change them.</w:t>
       </w:r>
     </w:p>
     <w:p>
@@ -260,7 +318,7 @@
         <w:spacing w:after="120"/>
       </w:pPr>
       <w:r>
-        <w:t xml:space="preserve">The one of you who's bathing that day does show now — Cameron on Tuesdays, Monique on Wednesdays. You won't both show on the same day, and that's on purpose: one of you has to stay on the front desk while the other bathes. So on a bathing day you've got the four groomers plus whichever one of you is bathing — that's five people, which is just enough for five huskies.</w:t>
+        <w:t xml:space="preserve">The one of you who's bathing that day does show now — Cameron on Tuesdays, Monique on Wednesdays. You won't both show on the same day, and that's on purpose: one of you has to stay on the front desk while the other bathes. So on a bathing day you've got the four groomers plus whichever one of you is bathing — that's five people, just enough for five huskies.</w:t>
       </w:r>
     </w:p>
     <w:p>

</xml_diff>